<commit_message>
docs: record null merge deployment verification
</commit_message>
<xml_diff>
--- a/jackyun-portal/docs/sync-null-auto-merge-3.61.1-20261029.docx
+++ b/jackyun-portal/docs/sync-null-auto-merge-3.61.1-20261029.docx
@@ -716,7 +716,7 @@
         <w:pStyle w:val="ListBullet"/>
       </w:pPr>
       <w:r>
-        <w:t>GitHub PR 与 Main 合并提交：待完成。</w:t>
+        <w:t>GitHub PR #178 已于 2026 年 10 月 29 日合并到 Main，提交 8743a28a510cb59b9d8a4054ee4be22ae15bc6663。</w:t>
       </w:r>
     </w:p>
     <w:p>
@@ -724,12 +724,12 @@
         <w:pStyle w:val="ListBullet"/>
       </w:pPr>
       <w:r>
-        <w:t>生产 Vercel 部署 READY 状态及 jackyun.top 别名：合并后核验。</w:t>
+        <w:t>Vercel 生产部署 dpl_2NASvW15MnNm61fNiPHPSKVGbW3L 状态 READY；源码与 Main 提交一致，别名包含 jackyun.top。</w:t>
       </w:r>
     </w:p>
     <w:p>
       <w:r>
-        <w:t>生产部署 READY 与源码提交一致性只证明此次代码已发布；真实账户上旧冲突队列的实际清理效果，需在目标账号同步后读取同步中心确认。</w:t>
+        <w:t>生产部署 READY 与源码提交一致性证明此次代码已发布；旧冲突队列的实际清理效果，仍需目标账号同步后读取同步中心确认。DOCX 页面视觉渲染尚未完成，因为工作区依赖未提供 LibreOffice。</w:t>
       </w:r>
     </w:p>
     <w:sectPr>

</xml_diff>

<commit_message>
docs: record null merge deployment verification (#179)
Record the NULL auto-merge fix and production deployment evidence.
</commit_message>
<xml_diff>
--- a/jackyun-portal/docs/sync-null-auto-merge-3.61.1-20261029.docx
+++ b/jackyun-portal/docs/sync-null-auto-merge-3.61.1-20261029.docx
@@ -716,7 +716,7 @@
         <w:pStyle w:val="ListBullet"/>
       </w:pPr>
       <w:r>
-        <w:t>GitHub PR 与 Main 合并提交：待完成。</w:t>
+        <w:t>GitHub PR #178 已于 2026 年 10 月 29 日合并到 Main，提交 8743a28a510cb59b9d8a4054ee4be22ae15bc6663。</w:t>
       </w:r>
     </w:p>
     <w:p>
@@ -724,12 +724,12 @@
         <w:pStyle w:val="ListBullet"/>
       </w:pPr>
       <w:r>
-        <w:t>生产 Vercel 部署 READY 状态及 jackyun.top 别名：合并后核验。</w:t>
+        <w:t>Vercel 生产部署 dpl_2NASvW15MnNm61fNiPHPSKVGbW3L 状态 READY；源码与 Main 提交一致，别名包含 jackyun.top。</w:t>
       </w:r>
     </w:p>
     <w:p>
       <w:r>
-        <w:t>生产部署 READY 与源码提交一致性只证明此次代码已发布；真实账户上旧冲突队列的实际清理效果，需在目标账号同步后读取同步中心确认。</w:t>
+        <w:t>生产部署 READY 与源码提交一致性证明此次代码已发布；旧冲突队列的实际清理效果，仍需目标账号同步后读取同步中心确认。DOCX 页面视觉渲染尚未完成，因为工作区依赖未提供 LibreOffice。</w:t>
       </w:r>
     </w:p>
     <w:sectPr>

</xml_diff>